<commit_message>
Campagne v6.2 : analyse, comparaison a v6.1 et article mis a jour
La relance avec le feedforward nominal fige (540 cellules, calculees sur la
machine de l'utilisateur) confirme toutes les conclusions :
- etage 1 identique a v6.1 dans les 540 cellules ;
- 0 cellule robustement faisable dans les trois bras ;
- meilleures marges robustes -0,4405 (v5), -0,0664 (v5b), -0,3177 (v5kp),
  contre -0,4392, -0,0667 et -0,3123 en v6.1 ;
- Friedman significatif, classement des methodes inchange.

Les resultats v6.2 deviennent la reference de l'article (chiffres et
figures) ; ceux de v6.1 sont conserves. Article FR/EN : paragraphe sur la
relance, limite E12 remplacee, protocole v6.2 cite. Plancher a d_min
recalcule avec le noyau corrige : toujours 13 cas sur 17 sous 0,8 V.

Co-Authored-By: Claude Opus 5.5 <noreply@anthropic.com>
Claude-Session: https://claude.ai/code/session_01U76hHprPmqnwy1U7ej63Jw
</commit_message>
<xml_diff>
--- a/docs/article/en/article_en.docx
+++ b/docs/article/en/article_en.docx
@@ -7495,7 +7495,7 @@
     </w:p>
     <w:bookmarkEnd w:id="40"/>
     <w:bookmarkEnd w:id="41"/>
-    <w:bookmarkStart w:id="66" w:name="sec:results"/>
+    <w:bookmarkStart w:id="67" w:name="sec:results"/>
     <w:p>
       <w:pPr>
         <w:pStyle w:val="Heading1"/>
@@ -8424,7 +8424,7 @@
       </w:r>
     </w:p>
     <w:bookmarkEnd w:id="49"/>
-    <w:bookmarkStart w:id="58" w:name="confirmatory-campaign"/>
+    <w:bookmarkStart w:id="59" w:name="confirmatory-campaign"/>
     <w:p>
       <w:pPr>
         <w:pStyle w:val="Heading2"/>
@@ -8932,7 +8932,7 @@
                 <m:t>−</m:t>
               </m:r>
               <m:r>
-                <m:t>0.439</m:t>
+                <m:t>0.440</m:t>
               </m:r>
             </m:oMath>
           </w:p>
@@ -8952,7 +8952,7 @@
                 <m:t>−</m:t>
               </m:r>
               <m:r>
-                <m:t>0.067</m:t>
+                <m:t>0.066</m:t>
               </m:r>
             </m:oMath>
           </w:p>
@@ -8972,7 +8972,7 @@
                 <m:t>−</m:t>
               </m:r>
               <m:r>
-                <m:t>0.312</m:t>
+                <m:t>0.318</m:t>
               </m:r>
             </m:oMath>
           </w:p>
@@ -9008,7 +9008,7 @@
             </w:pPr>
             <m:oMath>
               <m:r>
-                <m:t>2.0</m:t>
+                <m:t>6.8</m:t>
               </m:r>
               <m:r>
                 <m:rPr>
@@ -9046,7 +9046,7 @@
             </w:pPr>
             <m:oMath>
               <m:r>
-                <m:t>2.5</m:t>
+                <m:t>1.0</m:t>
               </m:r>
               <m:r>
                 <m:rPr>
@@ -9084,7 +9084,7 @@
             </w:pPr>
             <m:oMath>
               <m:r>
-                <m:t>1.1</m:t>
+                <m:t>1.9</m:t>
               </m:r>
               <m:r>
                 <m:rPr>
@@ -9106,7 +9106,7 @@
                     <m:t>−</m:t>
                   </m:r>
                   <m:r>
-                    <m:t>16</m:t>
+                    <m:t>15</m:t>
                   </m:r>
                 </m:sup>
               </m:sSup>
@@ -9147,7 +9147,7 @@
               <w:jc w:val="center"/>
             </w:pPr>
             <w:r>
-              <w:t xml:space="preserve">9</w:t>
+              <w:t xml:space="preserve">10</w:t>
             </w:r>
           </w:p>
         </w:tc>
@@ -9512,7 +9512,175 @@
         <w:t xml:space="preserve">. Figure labels in French.</w:t>
       </w:r>
     </w:p>
-    <w:bookmarkStart w:id="57" w:name="stage-3-and-sealed-test."/>
+    <w:bookmarkStart w:id="57" w:name="rerun-after-correcting-the-feedforward."/>
+    <w:p>
+      <w:pPr>
+        <w:pStyle w:val="Heading4"/>
+      </w:pPr>
+      <w:r>
+        <w:t xml:space="preserve">Rerun after correcting the feedforward.</w:t>
+      </w:r>
+    </w:p>
+    <w:p>
+      <w:pPr>
+        <w:pStyle w:val="FirstParagraph"/>
+      </w:pPr>
+      <w:r>
+        <w:t xml:space="preserve">The campaign was first computed with a defect: the stage-2 feedforward used</w:t>
+      </w:r>
+      <w:r>
+        <w:t xml:space="preserve"> </w:t>
+      </w:r>
+      <w:r>
+        <w:t xml:space="preserve">the perturbed plant parameters instead of the frozen nominal values. It was</w:t>
+      </w:r>
+      <w:r>
+        <w:t xml:space="preserve"> </w:t>
+      </w:r>
+      <w:r>
+        <w:t xml:space="preserve">rerun in full after correction (protocol v6.2), with the same seeds, budgets</w:t>
+      </w:r>
+      <w:r>
+        <w:t xml:space="preserve"> </w:t>
+      </w:r>
+      <w:r>
+        <w:t xml:space="preserve">and methods. The figures reported here are those of the rerun. Stage 1 is</w:t>
+      </w:r>
+      <w:r>
+        <w:t xml:space="preserve"> </w:t>
+      </w:r>
+      <w:r>
+        <w:t xml:space="preserve">reproduced identically in all 540 cells. At stage 2, the best robust margins</w:t>
+      </w:r>
+      <w:r>
+        <w:t xml:space="preserve"> </w:t>
+      </w:r>
+      <w:r>
+        <w:t xml:space="preserve">move from</w:t>
+      </w:r>
+      <w:r>
+        <w:t xml:space="preserve"> </w:t>
+      </w:r>
+      <m:oMath>
+        <m:r>
+          <m:rPr>
+            <m:sty m:val="p"/>
+          </m:rPr>
+          <m:t>−</m:t>
+        </m:r>
+        <m:r>
+          <m:t>0.439</m:t>
+        </m:r>
+      </m:oMath>
+      <w:r>
+        <w:t xml:space="preserve">,</w:t>
+      </w:r>
+      <w:r>
+        <w:t xml:space="preserve"> </w:t>
+      </w:r>
+      <m:oMath>
+        <m:r>
+          <m:rPr>
+            <m:sty m:val="p"/>
+          </m:rPr>
+          <m:t>−</m:t>
+        </m:r>
+        <m:r>
+          <m:t>0.067</m:t>
+        </m:r>
+      </m:oMath>
+      <w:r>
+        <w:t xml:space="preserve"> </w:t>
+      </w:r>
+      <w:r>
+        <w:t xml:space="preserve">and</w:t>
+      </w:r>
+      <w:r>
+        <w:t xml:space="preserve"> </w:t>
+      </w:r>
+      <m:oMath>
+        <m:r>
+          <m:rPr>
+            <m:sty m:val="p"/>
+          </m:rPr>
+          <m:t>−</m:t>
+        </m:r>
+        <m:r>
+          <m:t>0.312</m:t>
+        </m:r>
+      </m:oMath>
+      <w:r>
+        <w:t xml:space="preserve"> </w:t>
+      </w:r>
+      <w:r>
+        <w:t xml:space="preserve">to</w:t>
+      </w:r>
+      <w:r>
+        <w:t xml:space="preserve"> </w:t>
+      </w:r>
+      <m:oMath>
+        <m:r>
+          <m:rPr>
+            <m:sty m:val="p"/>
+          </m:rPr>
+          <m:t>−</m:t>
+        </m:r>
+        <m:r>
+          <m:t>0.440</m:t>
+        </m:r>
+      </m:oMath>
+      <w:r>
+        <w:t xml:space="preserve">,</w:t>
+      </w:r>
+      <w:r>
+        <w:t xml:space="preserve"> </w:t>
+      </w:r>
+      <m:oMath>
+        <m:r>
+          <m:rPr>
+            <m:sty m:val="p"/>
+          </m:rPr>
+          <m:t>−</m:t>
+        </m:r>
+        <m:r>
+          <m:t>0.066</m:t>
+        </m:r>
+      </m:oMath>
+      <w:r>
+        <w:t xml:space="preserve"> </w:t>
+      </w:r>
+      <w:r>
+        <w:t xml:space="preserve">and</w:t>
+      </w:r>
+      <w:r>
+        <w:t xml:space="preserve"> </w:t>
+      </w:r>
+      <m:oMath>
+        <m:r>
+          <m:rPr>
+            <m:sty m:val="p"/>
+          </m:rPr>
+          <m:t>−</m:t>
+        </m:r>
+        <m:r>
+          <m:t>0.318</m:t>
+        </m:r>
+      </m:oMath>
+      <w:r>
+        <w:t xml:space="preserve"> </w:t>
+      </w:r>
+      <w:r>
+        <w:t xml:space="preserve">(arms v5, v5b and</w:t>
+      </w:r>
+      <w:r>
+        <w:t xml:space="preserve"> </w:t>
+      </w:r>
+      <w:r>
+        <w:t xml:space="preserve">v5kp); no cell becomes feasible and the ranking of methods is unchanged.</w:t>
+      </w:r>
+    </w:p>
+    <w:bookmarkEnd w:id="57"/>
+    <w:bookmarkStart w:id="58" w:name="stage-3-and-sealed-test."/>
     <w:p>
       <w:pPr>
         <w:pStyle w:val="Heading4"/>
@@ -9560,9 +9728,9 @@
         <w:t xml:space="preserve">a later study.</w:t>
       </w:r>
     </w:p>
-    <w:bookmarkEnd w:id="57"/>
     <w:bookmarkEnd w:id="58"/>
-    <w:bookmarkStart w:id="59" w:name="X3d2c56be7a9a68d57ef1af71ab534498c5fc38a"/>
+    <w:bookmarkEnd w:id="59"/>
+    <w:bookmarkStart w:id="60" w:name="X3d2c56be7a9a68d57ef1af71ab534498c5fc38a"/>
     <w:p>
       <w:pPr>
         <w:pStyle w:val="Heading2"/>
@@ -9951,8 +10119,8 @@
         <w:t xml:space="preserve">the reference model.</w:t>
       </w:r>
     </w:p>
-    <w:bookmarkEnd w:id="59"/>
-    <w:bookmarkStart w:id="65" w:name="two-post-hoc-diagnostics"/>
+    <w:bookmarkEnd w:id="60"/>
+    <w:bookmarkStart w:id="66" w:name="two-post-hoc-diagnostics"/>
     <w:p>
       <w:pPr>
         <w:pStyle w:val="Heading2"/>
@@ -9991,7 +10159,7 @@
         <w:t xml:space="preserve">reported, but were used for no selection.</w:t>
       </w:r>
     </w:p>
-    <w:bookmarkStart w:id="60" w:name="voltage-floor-at-minimum-duty-ratio."/>
+    <w:bookmarkStart w:id="61" w:name="voltage-floor-at-minimum-duty-ratio."/>
     <w:p>
       <w:pPr>
         <w:pStyle w:val="Heading4"/>
@@ -10233,8 +10401,8 @@
         <w:t xml:space="preserve"> V.</w:t>
       </w:r>
     </w:p>
-    <w:bookmarkEnd w:id="60"/>
-    <w:bookmarkStart w:id="64" w:name="X4df65d5d0e6822cbfb303cbf4e66c660b5040ae"/>
+    <w:bookmarkEnd w:id="61"/>
+    <w:bookmarkStart w:id="65" w:name="X4df65d5d0e6822cbfb303cbf4e66c660b5040ae"/>
     <w:p>
       <w:pPr>
         <w:pStyle w:val="Heading4"/>
@@ -10431,18 +10599,18 @@
           <wp:inline>
             <wp:extent cx="5141776" cy="3979248"/>
             <wp:effectExtent b="0" l="0" r="0" t="0"/>
-            <wp:docPr descr="" title="" id="62" name="Picture"/>
+            <wp:docPr descr="" title="" id="63" name="Picture"/>
             <a:graphic>
               <a:graphicData uri="http://schemas.openxmlformats.org/drawingml/2006/picture">
                 <pic:pic>
                   <pic:nvPicPr>
-                    <pic:cNvPr descr="../../../figures/fig_trajectoire_b_libre.png" id="63" name="Picture"/>
+                    <pic:cNvPr descr="../../../figures/fig_trajectoire_b_libre.png" id="64" name="Picture"/>
                     <pic:cNvPicPr>
                       <a:picLocks noChangeArrowheads="1" noChangeAspect="1"/>
                     </pic:cNvPicPr>
                   </pic:nvPicPr>
                   <pic:blipFill>
-                    <a:blip r:embed="rId61"/>
+                    <a:blip r:embed="rId62"/>
                     <a:stretch>
                       <a:fillRect/>
                     </a:stretch>
@@ -10500,10 +10668,10 @@
         <w:t xml:space="preserve">cycle at the 24 V plateau. Figure labels in French.</w:t>
       </w:r>
     </w:p>
-    <w:bookmarkEnd w:id="64"/>
     <w:bookmarkEnd w:id="65"/>
     <w:bookmarkEnd w:id="66"/>
-    <w:bookmarkStart w:id="72" w:name="sec:discussion"/>
+    <w:bookmarkEnd w:id="67"/>
+    <w:bookmarkStart w:id="73" w:name="sec:discussion"/>
     <w:p>
       <w:pPr>
         <w:pStyle w:val="Heading1"/>
@@ -10512,7 +10680,7 @@
         <w:t xml:space="preserve">Discussion</w:t>
       </w:r>
     </w:p>
-    <w:bookmarkStart w:id="67" w:name="what-the-audit-changes-in-the-diagnosis."/>
+    <w:bookmarkStart w:id="68" w:name="what-the-audit-changes-in-the-diagnosis."/>
     <w:p>
       <w:pPr>
         <w:pStyle w:val="Heading4"/>
@@ -10627,8 +10795,8 @@
         <w:t xml:space="preserve">without the distinction between structural and pathological saturation.</w:t>
       </w:r>
     </w:p>
-    <w:bookmarkEnd w:id="67"/>
-    <w:bookmarkStart w:id="68" w:name="what-the-campaign-establishes."/>
+    <w:bookmarkEnd w:id="68"/>
+    <w:bookmarkStart w:id="69" w:name="what-the-campaign-establishes."/>
     <w:p>
       <w:pPr>
         <w:pStyle w:val="Heading4"/>
@@ -10716,8 +10884,8 @@
         <w:t xml:space="preserve">feasibility reachable, but not robustness: tuning freedom is not enough.</w:t>
       </w:r>
     </w:p>
-    <w:bookmarkEnd w:id="68"/>
-    <w:bookmarkStart w:id="69" w:name="a-physical-obstruction."/>
+    <w:bookmarkEnd w:id="69"/>
+    <w:bookmarkStart w:id="70" w:name="a-physical-obstruction."/>
     <w:p>
       <w:pPr>
         <w:pStyle w:val="Heading4"/>
@@ -10881,8 +11049,8 @@
         <w:t xml:space="preserve">before searching for gains.</w:t>
       </w:r>
     </w:p>
-    <w:bookmarkEnd w:id="69"/>
-    <w:bookmarkStart w:id="70" w:name="a-blind-spot-of-the-specification."/>
+    <w:bookmarkEnd w:id="70"/>
+    <w:bookmarkStart w:id="71" w:name="a-blind-spot-of-the-specification."/>
     <w:p>
       <w:pPr>
         <w:pStyle w:val="Heading4"/>
@@ -10929,8 +11097,8 @@
         <w:t xml:space="preserve">constraint on the oscillation amplitude over steady-state windows.</w:t>
       </w:r>
     </w:p>
-    <w:bookmarkEnd w:id="70"/>
-    <w:bookmarkStart w:id="71" w:name="fractional-character."/>
+    <w:bookmarkEnd w:id="71"/>
+    <w:bookmarkStart w:id="72" w:name="fractional-character."/>
     <w:p>
       <w:pPr>
         <w:pStyle w:val="Heading4"/>
@@ -10993,9 +11161,9 @@
         <w:t xml:space="preserve">equal-budget comparator that would allow such a judgement.</w:t>
       </w:r>
     </w:p>
-    <w:bookmarkEnd w:id="71"/>
     <w:bookmarkEnd w:id="72"/>
-    <w:bookmarkStart w:id="73" w:name="sec:limitations"/>
+    <w:bookmarkEnd w:id="73"/>
+    <w:bookmarkStart w:id="74" w:name="sec:limitations"/>
     <w:p>
       <w:pPr>
         <w:pStyle w:val="Heading1"/>
@@ -11122,54 +11290,31 @@
           <w:bCs/>
           <w:b/>
         </w:rPr>
-        <w:t xml:space="preserve">Defect corrected after the campaign.</w:t>
-      </w:r>
-      <w:r>
-        <w:t xml:space="preserve"> </w:t>
-      </w:r>
-      <w:r>
-        <w:t xml:space="preserve">The stage-2 feedforward</w:t>
-      </w:r>
-      <w:r>
-        <w:t xml:space="preserve"> </w:t>
-      </w:r>
-      <w:r>
-        <w:t xml:space="preserve">used the perturbed plant parameters instead of the frozen nominal values.</w:t>
-      </w:r>
-      <w:r>
-        <w:t xml:space="preserve"> </w:t>
-      </w:r>
-      <w:r>
-        <w:t xml:space="preserve">Re-evaluated after correction, the 540 retained candidates remain</w:t>
-      </w:r>
-      <w:r>
-        <w:t xml:space="preserve"> </w:t>
-      </w:r>
-      <w:r>
-        <w:t xml:space="preserve">infeasible, but 18 cells degrade by more than</w:t>
-      </w:r>
-      <w:r>
-        <w:t xml:space="preserve"> </w:t>
-      </w:r>
-      <m:oMath>
-        <m:r>
-          <m:t>0.05</m:t>
-        </m:r>
-      </m:oMath>
-      <w:r>
-        <w:t xml:space="preserve">: the defect favoured</w:t>
-      </w:r>
-      <w:r>
-        <w:t xml:space="preserve"> </w:t>
-      </w:r>
-      <w:r>
-        <w:t xml:space="preserve">the controllers, and some stage-2 margins are optimistic. The stage-2</w:t>
-      </w:r>
-      <w:r>
-        <w:t xml:space="preserve"> </w:t>
-      </w:r>
-      <w:r>
-        <w:t xml:space="preserve">search has not been rerun.</w:t>
+        <w:t xml:space="preserve">Defect corrected and campaign rerun.</w:t>
+      </w:r>
+      <w:r>
+        <w:t xml:space="preserve"> </w:t>
+      </w:r>
+      <w:r>
+        <w:t xml:space="preserve">The stage-2</w:t>
+      </w:r>
+      <w:r>
+        <w:t xml:space="preserve"> </w:t>
+      </w:r>
+      <w:r>
+        <w:t xml:space="preserve">feedforward first used the perturbed plant parameters. The campaign was</w:t>
+      </w:r>
+      <w:r>
+        <w:t xml:space="preserve"> </w:t>
+      </w:r>
+      <w:r>
+        <w:t xml:space="preserve">rerun in full after correction (protocol v6.2); the conclusions are</w:t>
+      </w:r>
+      <w:r>
+        <w:t xml:space="preserve"> </w:t>
+      </w:r>
+      <w:r>
+        <w:t xml:space="preserve">unchanged.</w:t>
       </w:r>
     </w:p>
     <w:p>
@@ -11431,8 +11576,8 @@
         <w:t xml:space="preserve">feasibility, not feasibility achieved, and their ranking depends on the arm.</w:t>
       </w:r>
     </w:p>
-    <w:bookmarkEnd w:id="73"/>
-    <w:bookmarkStart w:id="74" w:name="reproducibility"/>
+    <w:bookmarkEnd w:id="74"/>
+    <w:bookmarkStart w:id="75" w:name="reproducibility"/>
     <w:p>
       <w:pPr>
         <w:pStyle w:val="Heading1"/>
@@ -11452,7 +11597,7 @@
         <w:rPr>
           <w:rStyle w:val="VerbatimChar"/>
         </w:rPr>
-        <w:t xml:space="preserve">protocol/protocol_v6_1.json</w:t>
+        <w:t xml:space="preserve">protocol/protocol_v6_2.json</w:t>
       </w:r>
       <w:r>
         <w:t xml:space="preserve">,</w:t>
@@ -11470,7 +11615,7 @@
         <w:rPr>
           <w:rStyle w:val="VerbatimChar"/>
         </w:rPr>
-        <w:t xml:space="preserve">bf8859a2465011bf</w:t>
+        <w:t xml:space="preserve">884a44a0abf12452</w:t>
       </w:r>
       <w:r>
         <w:t xml:space="preserve">), the per-cell log, the seeds and the log of</w:t>
@@ -11494,13 +11639,13 @@
         <w:t xml:space="preserve"> </w:t>
       </w:r>
       <w:r>
-        <w:t xml:space="preserve">article. Protocol v6.1 is chained to version v6 and was amended before the</w:t>
-      </w:r>
-      <w:r>
-        <w:t xml:space="preserve"> </w:t>
-      </w:r>
-      <w:r>
-        <w:t xml:space="preserve">first campaign seed. Every number in this article is generated by</w:t>
+        <w:t xml:space="preserve">article. Protocol v6.2 is chained to versions v6.1 and v6; every amendment is</w:t>
+      </w:r>
+      <w:r>
+        <w:t xml:space="preserve"> </w:t>
+      </w:r>
+      <w:r>
+        <w:t xml:space="preserve">justified. Every number in this article is generated by</w:t>
       </w:r>
       <w:r>
         <w:t xml:space="preserve"> </w:t>
@@ -11518,7 +11663,7 @@
         <w:t xml:space="preserve">from the JSON results.</w:t>
       </w:r>
     </w:p>
-    <w:bookmarkEnd w:id="74"/>
+    <w:bookmarkEnd w:id="75"/>
     <w:sectPr/>
   </w:body>
 </w:document>

</xml_diff>